<commit_message>
changement dans le template expert comptable avec retard
</commit_message>
<xml_diff>
--- a/app/public/templates/Expert-comptable-avec-retard.docx
+++ b/app/public/templates/Expert-comptable-avec-retard.docx
@@ -388,7 +388,23 @@
         <w:rPr>
           <w:rFonts w:ascii="Arial" w:hAnsi="Arial" w:cs="Arial"/>
         </w:rPr>
-        <w:t>{raisonSociale}</w:t>
+        <w:t>{</w:t>
+      </w:r>
+      <w:proofErr w:type="spellStart"/>
+      <w:proofErr w:type="gramStart"/>
+      <w:r>
+        <w:rPr>
+          <w:rFonts w:ascii="Arial" w:hAnsi="Arial" w:cs="Arial"/>
+        </w:rPr>
+        <w:t>raisonSociale</w:t>
+      </w:r>
+      <w:proofErr w:type="spellEnd"/>
+      <w:proofErr w:type="gramEnd"/>
+      <w:r>
+        <w:rPr>
+          <w:rFonts w:ascii="Arial" w:hAnsi="Arial" w:cs="Arial"/>
+        </w:rPr>
+        <w:t>}</w:t>
       </w:r>
     </w:p>
     <w:p>
@@ -459,7 +475,29 @@
           <w:sz w:val="22"/>
           <w:szCs w:val="22"/>
         </w:rPr>
-        <w:t>{jourDebut}</w:t>
+        <w:t>{</w:t>
+      </w:r>
+      <w:proofErr w:type="spellStart"/>
+      <w:r>
+        <w:rPr>
+          <w:rFonts w:ascii="Arial" w:hAnsi="Arial" w:cs="Arial"/>
+          <w:b/>
+          <w:bCs/>
+          <w:sz w:val="22"/>
+          <w:szCs w:val="22"/>
+        </w:rPr>
+        <w:t>jourDebut</w:t>
+      </w:r>
+      <w:proofErr w:type="spellEnd"/>
+      <w:r>
+        <w:rPr>
+          <w:rFonts w:ascii="Arial" w:hAnsi="Arial" w:cs="Arial"/>
+          <w:b/>
+          <w:bCs/>
+          <w:sz w:val="22"/>
+          <w:szCs w:val="22"/>
+        </w:rPr>
+        <w:t>}</w:t>
       </w:r>
       <w:r>
         <w:rPr>
@@ -470,8 +508,9 @@
           <w:szCs w:val="22"/>
           <w:vertAlign w:val="superscript"/>
         </w:rPr>
-        <w:t>{exposantDebut}</w:t>
-      </w:r>
+        <w:t>{</w:t>
+      </w:r>
+      <w:proofErr w:type="spellStart"/>
       <w:r>
         <w:rPr>
           <w:rFonts w:ascii="Arial" w:hAnsi="Arial" w:cs="Arial"/>
@@ -479,8 +518,53 @@
           <w:bCs/>
           <w:sz w:val="22"/>
           <w:szCs w:val="22"/>
-        </w:rPr>
-        <w:t>{finCouverture}</w:t>
+          <w:vertAlign w:val="superscript"/>
+        </w:rPr>
+        <w:t>exposantDebut</w:t>
+      </w:r>
+      <w:proofErr w:type="spellEnd"/>
+      <w:r>
+        <w:rPr>
+          <w:rFonts w:ascii="Arial" w:hAnsi="Arial" w:cs="Arial"/>
+          <w:b/>
+          <w:bCs/>
+          <w:sz w:val="22"/>
+          <w:szCs w:val="22"/>
+          <w:vertAlign w:val="superscript"/>
+        </w:rPr>
+        <w:t>}</w:t>
+      </w:r>
+      <w:r>
+        <w:rPr>
+          <w:rFonts w:ascii="Arial" w:hAnsi="Arial" w:cs="Arial"/>
+          <w:b/>
+          <w:bCs/>
+          <w:sz w:val="22"/>
+          <w:szCs w:val="22"/>
+        </w:rPr>
+        <w:t>{</w:t>
+      </w:r>
+      <w:proofErr w:type="spellStart"/>
+      <w:r>
+        <w:rPr>
+          <w:rFonts w:ascii="Arial" w:hAnsi="Arial" w:cs="Arial"/>
+          <w:b/>
+          <w:bCs/>
+          <w:sz w:val="22"/>
+          <w:szCs w:val="22"/>
+        </w:rPr>
+        <w:t>finCouverture</w:t>
+      </w:r>
+      <w:proofErr w:type="spellEnd"/>
+      <w:r>
+        <w:rPr>
+          <w:rFonts w:ascii="Arial" w:hAnsi="Arial" w:cs="Arial"/>
+          <w:b/>
+          <w:bCs/>
+          <w:sz w:val="22"/>
+          <w:szCs w:val="22"/>
+        </w:rPr>
+        <w:t>}</w:t>
       </w:r>
     </w:p>
     <w:p>
@@ -895,7 +979,7 @@
           <w:sz w:val="24"/>
           <w:szCs w:val="24"/>
         </w:rPr>
-        <w:t xml:space="preserve">A l’aimable attention de </w:t>
+        <w:t xml:space="preserve">A l’attention de </w:t>
       </w:r>
       <w:r>
         <w:rPr>
@@ -905,7 +989,29 @@
           <w:sz w:val="24"/>
           <w:szCs w:val="24"/>
         </w:rPr>
-        <w:t>{civilite}</w:t>
+        <w:t>{</w:t>
+      </w:r>
+      <w:proofErr w:type="spellStart"/>
+      <w:r>
+        <w:rPr>
+          <w:rFonts w:ascii="Aptos" w:hAnsi="Aptos"/>
+          <w:b/>
+          <w:bCs/>
+          <w:sz w:val="24"/>
+          <w:szCs w:val="24"/>
+        </w:rPr>
+        <w:t>civilite</w:t>
+      </w:r>
+      <w:proofErr w:type="spellEnd"/>
+      <w:r>
+        <w:rPr>
+          <w:rFonts w:ascii="Aptos" w:hAnsi="Aptos"/>
+          <w:b/>
+          <w:bCs/>
+          <w:sz w:val="24"/>
+          <w:szCs w:val="24"/>
+        </w:rPr>
+        <w:t>}</w:t>
       </w:r>
       <w:r>
         <w:rPr>
@@ -927,6 +1033,7 @@
         </w:rPr>
         <w:t>{</w:t>
       </w:r>
+      <w:proofErr w:type="spellStart"/>
       <w:r>
         <w:rPr>
           <w:rFonts w:ascii="Aptos" w:hAnsi="Aptos"/>
@@ -937,6 +1044,7 @@
         </w:rPr>
         <w:t>representant</w:t>
       </w:r>
+      <w:proofErr w:type="spellEnd"/>
       <w:r>
         <w:rPr>
           <w:rFonts w:ascii="Aptos" w:hAnsi="Aptos"/>
@@ -968,6 +1076,8 @@
         </w:rPr>
         <w:t>{</w:t>
       </w:r>
+      <w:proofErr w:type="spellStart"/>
+      <w:proofErr w:type="gramStart"/>
       <w:r>
         <w:rPr>
           <w:b/>
@@ -977,6 +1087,8 @@
         </w:rPr>
         <w:t>titreRepresentant</w:t>
       </w:r>
+      <w:proofErr w:type="spellEnd"/>
+      <w:proofErr w:type="gramEnd"/>
       <w:r>
         <w:rPr>
           <w:b/>
@@ -1003,7 +1115,29 @@
           <w:sz w:val="24"/>
           <w:szCs w:val="24"/>
         </w:rPr>
-        <w:t>{raisonSociale}</w:t>
+        <w:t>{</w:t>
+      </w:r>
+      <w:proofErr w:type="spellStart"/>
+      <w:r>
+        <w:rPr>
+          <w:rFonts w:ascii="Aptos" w:hAnsi="Aptos"/>
+          <w:b/>
+          <w:bCs/>
+          <w:sz w:val="24"/>
+          <w:szCs w:val="24"/>
+        </w:rPr>
+        <w:t>raisonSociale</w:t>
+      </w:r>
+      <w:proofErr w:type="spellEnd"/>
+      <w:r>
+        <w:rPr>
+          <w:rFonts w:ascii="Aptos" w:hAnsi="Aptos"/>
+          <w:b/>
+          <w:bCs/>
+          <w:sz w:val="24"/>
+          <w:szCs w:val="24"/>
+        </w:rPr>
+        <w:t>}</w:t>
       </w:r>
       <w:r>
         <w:rPr>
@@ -1031,7 +1165,25 @@
           <w:sz w:val="24"/>
           <w:szCs w:val="24"/>
         </w:rPr>
-        <w:t>{adresse}</w:t>
+        <w:t>{</w:t>
+      </w:r>
+      <w:proofErr w:type="gramStart"/>
+      <w:r>
+        <w:rPr>
+          <w:rFonts w:ascii="Aptos" w:hAnsi="Aptos"/>
+          <w:sz w:val="24"/>
+          <w:szCs w:val="24"/>
+        </w:rPr>
+        <w:t>adresse</w:t>
+      </w:r>
+      <w:proofErr w:type="gramEnd"/>
+      <w:r>
+        <w:rPr>
+          <w:rFonts w:ascii="Aptos" w:hAnsi="Aptos"/>
+          <w:sz w:val="24"/>
+          <w:szCs w:val="24"/>
+        </w:rPr>
+        <w:t>}</w:t>
       </w:r>
       <w:r>
         <w:rPr>
@@ -1097,6 +1249,7 @@
           <w:szCs w:val="24"/>
         </w:rPr>
       </w:pPr>
+      <w:proofErr w:type="gramStart"/>
       <w:r>
         <w:rPr>
           <w:rFonts w:ascii="Aptos" w:hAnsi="Aptos" w:cs="Arial"/>
@@ -1104,7 +1257,26 @@
           <w:sz w:val="24"/>
           <w:szCs w:val="24"/>
         </w:rPr>
-        <w:t>délais de paiement modifiant les dispositions de la loi 15-95 relative au code de commerce</w:t>
+        <w:t>délais</w:t>
+      </w:r>
+      <w:proofErr w:type="gramEnd"/>
+      <w:r>
+        <w:rPr>
+          <w:rFonts w:ascii="Aptos" w:hAnsi="Aptos" w:cs="Arial"/>
+          <w:b/>
+          <w:sz w:val="24"/>
+          <w:szCs w:val="24"/>
+        </w:rPr>
+        <w:t xml:space="preserve"> de paiement modifiant les dispositions de la loi 15-95 relative au code de commerce</w:t>
+      </w:r>
+      <w:r>
+        <w:rPr>
+          <w:rFonts w:ascii="Aptos" w:hAnsi="Aptos" w:cs="Arial"/>
+          <w:b/>
+          <w:sz w:val="24"/>
+          <w:szCs w:val="24"/>
+        </w:rPr>
+        <w:t>.</w:t>
       </w:r>
     </w:p>
     <w:p>
@@ -1171,7 +1343,29 @@
           <w:sz w:val="24"/>
           <w:szCs w:val="24"/>
         </w:rPr>
-        <w:t>{periodeCourte}</w:t>
+        <w:t>{</w:t>
+      </w:r>
+      <w:proofErr w:type="spellStart"/>
+      <w:r>
+        <w:rPr>
+          <w:rFonts w:ascii="Aptos" w:hAnsi="Aptos"/>
+          <w:b/>
+          <w:bCs/>
+          <w:sz w:val="24"/>
+          <w:szCs w:val="24"/>
+        </w:rPr>
+        <w:t>periodeCourte</w:t>
+      </w:r>
+      <w:proofErr w:type="spellEnd"/>
+      <w:r>
+        <w:rPr>
+          <w:rFonts w:ascii="Aptos" w:hAnsi="Aptos"/>
+          <w:b/>
+          <w:bCs/>
+          <w:sz w:val="24"/>
+          <w:szCs w:val="24"/>
+        </w:rPr>
+        <w:t>}</w:t>
       </w:r>
     </w:p>
     <w:p>
@@ -1223,8 +1417,9 @@
           <w:sz w:val="24"/>
           <w:szCs w:val="24"/>
         </w:rPr>
-        <w:t>{raisonSociale}</w:t>
-      </w:r>
+        <w:t>{</w:t>
+      </w:r>
+      <w:proofErr w:type="spellStart"/>
       <w:r>
         <w:rPr>
           <w:rFonts w:ascii="Aptos" w:hAnsi="Aptos"/>
@@ -1233,6 +1428,27 @@
           <w:sz w:val="24"/>
           <w:szCs w:val="24"/>
         </w:rPr>
+        <w:t>raisonSociale</w:t>
+      </w:r>
+      <w:proofErr w:type="spellEnd"/>
+      <w:r>
+        <w:rPr>
+          <w:rFonts w:ascii="Aptos" w:hAnsi="Aptos"/>
+          <w:b/>
+          <w:bCs/>
+          <w:sz w:val="24"/>
+          <w:szCs w:val="24"/>
+        </w:rPr>
+        <w:t>}</w:t>
+      </w:r>
+      <w:r>
+        <w:rPr>
+          <w:rFonts w:ascii="Aptos" w:hAnsi="Aptos"/>
+          <w:b/>
+          <w:bCs/>
+          <w:sz w:val="24"/>
+          <w:szCs w:val="24"/>
+        </w:rPr>
         <w:t xml:space="preserve"> </w:t>
       </w:r>
       <w:r>
@@ -1251,7 +1467,29 @@
           <w:sz w:val="24"/>
           <w:szCs w:val="24"/>
         </w:rPr>
-        <w:t>{periodeCourte}</w:t>
+        <w:t>{</w:t>
+      </w:r>
+      <w:proofErr w:type="spellStart"/>
+      <w:r>
+        <w:rPr>
+          <w:rFonts w:ascii="Aptos" w:hAnsi="Aptos"/>
+          <w:b/>
+          <w:bCs/>
+          <w:sz w:val="24"/>
+          <w:szCs w:val="24"/>
+        </w:rPr>
+        <w:t>periodeCourte</w:t>
+      </w:r>
+      <w:proofErr w:type="spellEnd"/>
+      <w:r>
+        <w:rPr>
+          <w:rFonts w:ascii="Aptos" w:hAnsi="Aptos"/>
+          <w:b/>
+          <w:bCs/>
+          <w:sz w:val="24"/>
+          <w:szCs w:val="24"/>
+        </w:rPr>
+        <w:t>}</w:t>
       </w:r>
       <w:r>
         <w:rPr>
@@ -1326,8 +1564,9 @@
           <w:sz w:val="24"/>
           <w:szCs w:val="24"/>
         </w:rPr>
-        <w:t>{raisonSociale}</w:t>
-      </w:r>
+        <w:t>{</w:t>
+      </w:r>
+      <w:proofErr w:type="spellStart"/>
       <w:r>
         <w:rPr>
           <w:rFonts w:ascii="Aptos" w:hAnsi="Aptos"/>
@@ -1336,6 +1575,27 @@
           <w:sz w:val="24"/>
           <w:szCs w:val="24"/>
         </w:rPr>
+        <w:t>raisonSociale</w:t>
+      </w:r>
+      <w:proofErr w:type="spellEnd"/>
+      <w:r>
+        <w:rPr>
+          <w:rFonts w:ascii="Aptos" w:hAnsi="Aptos"/>
+          <w:b/>
+          <w:bCs/>
+          <w:sz w:val="24"/>
+          <w:szCs w:val="24"/>
+        </w:rPr>
+        <w:t>}</w:t>
+      </w:r>
+      <w:r>
+        <w:rPr>
+          <w:rFonts w:ascii="Aptos" w:hAnsi="Aptos"/>
+          <w:b/>
+          <w:bCs/>
+          <w:sz w:val="24"/>
+          <w:szCs w:val="24"/>
+        </w:rPr>
         <w:t xml:space="preserve"> </w:t>
       </w:r>
       <w:r>
@@ -1344,7 +1604,7 @@
           <w:sz w:val="24"/>
           <w:szCs w:val="24"/>
         </w:rPr>
-        <w:t>qui doit s’assurer de leur exhaustivité et de sincérité. Il nous appartient de vérifier la concordance de ces informations avec les justificatifs des informations figurant sur les factures non payées dans les délais prévus à l’article 2.78 de la loi 69-21.</w:t>
+        <w:t>qui doit s’assurer de leur exhaustivité et sincérité. Il nous appartient de vérifier la concordance de ces informations avec les justificatifs des informations figurant sur les factures non payées dans les délais prévus à l’article 2.78 de la loi 69-21.</w:t>
       </w:r>
     </w:p>
     <w:p>
@@ -1431,8 +1691,9 @@
           <w:sz w:val="24"/>
           <w:szCs w:val="24"/>
         </w:rPr>
-        <w:t>{raisonSociale}</w:t>
-      </w:r>
+        <w:t>{</w:t>
+      </w:r>
+      <w:proofErr w:type="spellStart"/>
       <w:r>
         <w:rPr>
           <w:rFonts w:ascii="Aptos" w:hAnsi="Aptos"/>
@@ -1441,6 +1702,27 @@
           <w:sz w:val="24"/>
           <w:szCs w:val="24"/>
         </w:rPr>
+        <w:t>raisonSociale</w:t>
+      </w:r>
+      <w:proofErr w:type="spellEnd"/>
+      <w:r>
+        <w:rPr>
+          <w:rFonts w:ascii="Aptos" w:hAnsi="Aptos"/>
+          <w:b/>
+          <w:bCs/>
+          <w:sz w:val="24"/>
+          <w:szCs w:val="24"/>
+        </w:rPr>
+        <w:t>}</w:t>
+      </w:r>
+      <w:r>
+        <w:rPr>
+          <w:rFonts w:ascii="Aptos" w:hAnsi="Aptos"/>
+          <w:b/>
+          <w:bCs/>
+          <w:sz w:val="24"/>
+          <w:szCs w:val="24"/>
+        </w:rPr>
         <w:t xml:space="preserve"> </w:t>
       </w:r>
       <w:r>
@@ -1459,7 +1741,29 @@
           <w:sz w:val="24"/>
           <w:szCs w:val="24"/>
         </w:rPr>
-        <w:t>{periodeCourte}</w:t>
+        <w:t>{</w:t>
+      </w:r>
+      <w:proofErr w:type="spellStart"/>
+      <w:r>
+        <w:rPr>
+          <w:rFonts w:ascii="Aptos" w:hAnsi="Aptos" w:cs="Arial"/>
+          <w:b/>
+          <w:bCs/>
+          <w:sz w:val="24"/>
+          <w:szCs w:val="24"/>
+        </w:rPr>
+        <w:t>periodeCourte</w:t>
+      </w:r>
+      <w:proofErr w:type="spellEnd"/>
+      <w:r>
+        <w:rPr>
+          <w:rFonts w:ascii="Aptos" w:hAnsi="Aptos" w:cs="Arial"/>
+          <w:b/>
+          <w:bCs/>
+          <w:sz w:val="24"/>
+          <w:szCs w:val="24"/>
+        </w:rPr>
+        <w:t>}</w:t>
       </w:r>
       <w:r>
         <w:rPr>
@@ -1539,7 +1843,31 @@
           <w:u w:val="single"/>
           <w:lang w:eastAsia="fr-FR"/>
         </w:rPr>
-        <w:t>{lieu}</w:t>
+        <w:t>{</w:t>
+      </w:r>
+      <w:proofErr w:type="gramStart"/>
+      <w:r>
+        <w:rPr>
+          <w:rFonts w:ascii="Aptos" w:hAnsi="Aptos" w:cs="Arial"/>
+          <w:kern w:val="2"/>
+          <w:sz w:val="24"/>
+          <w:szCs w:val="24"/>
+          <w:u w:val="single"/>
+          <w:lang w:eastAsia="fr-FR"/>
+        </w:rPr>
+        <w:t>lieu</w:t>
+      </w:r>
+      <w:proofErr w:type="gramEnd"/>
+      <w:r>
+        <w:rPr>
+          <w:rFonts w:ascii="Aptos" w:hAnsi="Aptos" w:cs="Arial"/>
+          <w:kern w:val="2"/>
+          <w:sz w:val="24"/>
+          <w:szCs w:val="24"/>
+          <w:u w:val="single"/>
+          <w:lang w:eastAsia="fr-FR"/>
+        </w:rPr>
+        <w:t>}</w:t>
       </w:r>
       <w:r>
         <w:rPr>
@@ -1572,7 +1900,31 @@
           <w:u w:val="single"/>
           <w:lang w:eastAsia="fr-FR"/>
         </w:rPr>
-        <w:t>{dateSignature}</w:t>
+        <w:t>{</w:t>
+      </w:r>
+      <w:proofErr w:type="spellStart"/>
+      <w:r>
+        <w:rPr>
+          <w:rFonts w:ascii="Aptos" w:hAnsi="Aptos" w:cs="Arial"/>
+          <w:kern w:val="2"/>
+          <w:sz w:val="24"/>
+          <w:szCs w:val="24"/>
+          <w:u w:val="single"/>
+          <w:lang w:eastAsia="fr-FR"/>
+        </w:rPr>
+        <w:t>dateSignature</w:t>
+      </w:r>
+      <w:proofErr w:type="spellEnd"/>
+      <w:r>
+        <w:rPr>
+          <w:rFonts w:ascii="Aptos" w:hAnsi="Aptos" w:cs="Arial"/>
+          <w:kern w:val="2"/>
+          <w:sz w:val="24"/>
+          <w:szCs w:val="24"/>
+          <w:u w:val="single"/>
+          <w:lang w:eastAsia="fr-FR"/>
+        </w:rPr>
+        <w:t>}</w:t>
       </w:r>
     </w:p>
     <w:p>
@@ -1719,7 +2071,29 @@
           <w:szCs w:val="22"/>
           <w:lang w:val="en-GB"/>
         </w:rPr>
-        <w:t>{signataire}</w:t>
+        <w:t>{</w:t>
+      </w:r>
+      <w:proofErr w:type="spellStart"/>
+      <w:r>
+        <w:rPr>
+          <w:rFonts w:ascii="Calibri" w:hAnsi="Calibri" w:cs="Calibri"/>
+          <w:b/>
+          <w:iCs/>
+          <w:szCs w:val="22"/>
+          <w:lang w:val="en-GB"/>
+        </w:rPr>
+        <w:t>signataire</w:t>
+      </w:r>
+      <w:proofErr w:type="spellEnd"/>
+      <w:r>
+        <w:rPr>
+          <w:rFonts w:ascii="Calibri" w:hAnsi="Calibri" w:cs="Calibri"/>
+          <w:b/>
+          <w:iCs/>
+          <w:szCs w:val="22"/>
+          <w:lang w:val="en-GB"/>
+        </w:rPr>
+        <w:t>}</w:t>
       </w:r>
     </w:p>
     <w:p>
@@ -3088,37 +3462,37 @@
       </w:rPr>
     </w:lvl>
   </w:abstractNum>
-  <w:num w:numId="1" w16cid:durableId="460726724">
+  <w:num w:numId="1" w16cid:durableId="624652680">
     <w:abstractNumId w:val="5"/>
   </w:num>
-  <w:num w:numId="2" w16cid:durableId="370884733">
+  <w:num w:numId="2" w16cid:durableId="741832293">
     <w:abstractNumId w:val="3"/>
   </w:num>
-  <w:num w:numId="3" w16cid:durableId="1315598474">
+  <w:num w:numId="3" w16cid:durableId="1321614652">
     <w:abstractNumId w:val="6"/>
   </w:num>
-  <w:num w:numId="4" w16cid:durableId="466162559">
+  <w:num w:numId="4" w16cid:durableId="1512642398">
     <w:abstractNumId w:val="9"/>
   </w:num>
-  <w:num w:numId="5" w16cid:durableId="671296704">
+  <w:num w:numId="5" w16cid:durableId="822041464">
     <w:abstractNumId w:val="10"/>
   </w:num>
-  <w:num w:numId="6" w16cid:durableId="211574147">
+  <w:num w:numId="6" w16cid:durableId="1244218496">
     <w:abstractNumId w:val="0"/>
   </w:num>
-  <w:num w:numId="7" w16cid:durableId="912353395">
+  <w:num w:numId="7" w16cid:durableId="331493306">
     <w:abstractNumId w:val="2"/>
   </w:num>
-  <w:num w:numId="8" w16cid:durableId="1660964200">
+  <w:num w:numId="8" w16cid:durableId="859661688">
     <w:abstractNumId w:val="1"/>
   </w:num>
-  <w:num w:numId="9" w16cid:durableId="1182622744">
+  <w:num w:numId="9" w16cid:durableId="17660107">
     <w:abstractNumId w:val="7"/>
   </w:num>
-  <w:num w:numId="10" w16cid:durableId="717896808">
+  <w:num w:numId="10" w16cid:durableId="1243763063">
     <w:abstractNumId w:val="8"/>
   </w:num>
-  <w:num w:numId="11" w16cid:durableId="764958986">
+  <w:num w:numId="11" w16cid:durableId="2136824556">
     <w:abstractNumId w:val="4"/>
   </w:num>
 </w:numbering>

</xml_diff>